<commit_message>
Update tracker and structure doc with confirmed owners and details
- Name Feron (commercial) and Jason (product) as leads / sign-off.
- Two gaps: owner marked TBD (not Kelly); add explicit Session 3
  agenda item to assign an owner.
- SharePoint roadmap: Kelly has access; Jason to commit Product team
  to maintain it.

Co-Authored-By: Claude Opus 4.8 <noreply@anthropic.com>
Claude-Session: https://claude.ai/code/session_012kg3Y6dfNgYmGi2er96sJG
</commit_message>
<xml_diff>
--- a/Meeting_Structure_Proposal.docx
+++ b/Meeting_Structure_Proposal.docx
@@ -53,6 +53,24 @@
           <w:szCs w:val="21"/>
         </w:rPr>
         <w:t xml:space="preserve">Purpose:  Bridge the gap between what Product is building on the roadmap and Commercial's ability to prepare customers, create awareness, and feed customer demand back into Product. A two-way conversation, held monthly.</w:t>
+      </w:r>
+    </w:p>
+    <w:p>
+      <w:pPr>
+        <w:spacing w:after="90"/>
+      </w:pPr>
+      <w:r>
+        <w:rPr>
+          <w:rFonts w:ascii="Arial" w:cs="Arial" w:eastAsia="Arial" w:hAnsi="Arial"/>
+          <w:b w:val="false"/>
+          <w:bCs w:val="false"/>
+          <w:i/>
+          <w:iCs/>
+          <w:color w:val="555555"/>
+          <w:sz w:val="19"/>
+          <w:szCs w:val="19"/>
+        </w:rPr>
+        <w:t xml:space="preserve">Leads:  Feron (Commercial) and Jason (Product).  This structure is shared with them for sign-off before adoption.</w:t>
       </w:r>
     </w:p>
     <w:p>
@@ -796,7 +814,7 @@
                 <w:sz w:val="19"/>
                 <w:szCs w:val="19"/>
               </w:rPr>
-              <w:t xml:space="preserve">9.  New actions, owners &amp; decisions</w:t>
+              <w:t xml:space="preserve">9.  New actions, owners &amp; decisions  (incl. assign owner for the two gaps)</w:t>
             </w:r>
           </w:p>
         </w:tc>
@@ -1005,7 +1023,7 @@
           <w:sz w:val="21"/>
           <w:szCs w:val="21"/>
         </w:rPr>
-        <w:t xml:space="preserve">Kelly (Coordinator):  schedules the session, sets the agenda, maintains the tracker, captures decisions &amp; actions, circulates the summary, and makes sure the right info flows between Product and Commercial.</w:t>
+        <w:t xml:space="preserve">Kelly (Coordinator):  schedules the session, sets the agenda, maintains the tracker, captures decisions &amp; actions, circulates the summary, and makes sure the right info flows between Product and Commercial. Does not own content.</w:t>
       </w:r>
     </w:p>
     <w:p>
@@ -1023,7 +1041,7 @@
           <w:sz w:val="21"/>
           <w:szCs w:val="21"/>
         </w:rPr>
-        <w:t xml:space="preserve">Product:  owns and updates the roadmap (in the Global Product SharePoint folder), brings updates, demos and target dates.</w:t>
+        <w:t xml:space="preserve">Jason (Product lead):  commits the Product team to keep the roadmap updated in the Global Product SharePoint folder; brings updates, demos and target dates.</w:t>
       </w:r>
     </w:p>
     <w:p>
@@ -1041,7 +1059,7 @@
           <w:sz w:val="21"/>
           <w:szCs w:val="21"/>
         </w:rPr>
-        <w:t xml:space="preserve">Commercial:  brings customer/market requests and competitive intel; owns GTM readiness.</w:t>
+        <w:t xml:space="preserve">Feron (Commercial lead):  brings customer/market requests and competitive intel; owns GTM readiness.</w:t>
       </w:r>
     </w:p>
     <w:p>
@@ -1059,7 +1077,7 @@
           <w:sz w:val="21"/>
           <w:szCs w:val="21"/>
         </w:rPr>
-        <w:t xml:space="preserve">Owners TBD:  competitive analysis and the product-performance narrative need owners agreed — Kelly tracks that they get assigned, but does not own them.</w:t>
+        <w:t xml:space="preserve">Owners TBD (not Kelly):  competitive analysis and the product-performance narrative have no owner — assigning one is a Session 3 decision. Kelly tracks that it gets assigned; it does not default to her.</w:t>
       </w:r>
     </w:p>
     <w:p>
@@ -1199,7 +1217,7 @@
           <w:sz w:val="21"/>
           <w:szCs w:val="21"/>
         </w:rPr>
-        <w:t xml:space="preserve">Global Product SharePoint folder:  single home for the product roadmap with status and target dates.</w:t>
+        <w:t xml:space="preserve">Global Product SharePoint folder:  single home for the product roadmap with status and target dates. Kelly has access; Jason to commit Product team to keep it updated.</w:t>
       </w:r>
     </w:p>
     <w:p>

</xml_diff>

<commit_message>
Replace named references with 'Facilitator' role in structure proposal
Genericise the coordinator role throughout so the document describes the
facilitator function rather than a named individual.

Co-Authored-By: Claude Opus 4.8 <noreply@anthropic.com>
Claude-Session: https://claude.ai/code/session_012kg3Y6dfNgYmGi2er96sJG
</commit_message>
<xml_diff>
--- a/Meeting_Structure_Proposal.docx
+++ b/Meeting_Structure_Proposal.docx
@@ -104,7 +104,7 @@
           <w:sz w:val="19"/>
           <w:szCs w:val="19"/>
         </w:rPr>
-        <w:t xml:space="preserve">Each section is brought by its owner. Kelly facilitates, keeps time, and captures actions — Kelly does not own the content of Product or Commercial sections.</w:t>
+        <w:t xml:space="preserve">Each section is brought by its owner. The facilitator keeps time and captures actions — the facilitator does not own the content of Product or Commercial sections.</w:t>
       </w:r>
     </w:p>
     <w:tbl>
@@ -246,7 +246,7 @@
                 <w:sz w:val="19"/>
                 <w:szCs w:val="19"/>
               </w:rPr>
-              <w:t xml:space="preserve">Kelly</w:t>
+              <w:t xml:space="preserve">Facilitator</w:t>
             </w:r>
           </w:p>
         </w:tc>
@@ -838,7 +838,7 @@
                 <w:sz w:val="19"/>
                 <w:szCs w:val="19"/>
               </w:rPr>
-              <w:t xml:space="preserve">Kelly</w:t>
+              <w:t xml:space="preserve">Facilitator</w:t>
             </w:r>
           </w:p>
         </w:tc>
@@ -1023,7 +1023,7 @@
           <w:sz w:val="21"/>
           <w:szCs w:val="21"/>
         </w:rPr>
-        <w:t xml:space="preserve">Kelly (Coordinator):  schedules the session, sets the agenda, maintains the tracker, captures decisions &amp; actions, circulates the summary, and makes sure the right info flows between Product and Commercial. Does not own content.</w:t>
+        <w:t xml:space="preserve">Facilitator:  schedules the session, sets the agenda, maintains the tracker, captures decisions &amp; actions, circulates the summary, and makes sure the right info flows between Product and Commercial. Does not own content.</w:t>
       </w:r>
     </w:p>
     <w:p>
@@ -1077,7 +1077,7 @@
           <w:sz w:val="21"/>
           <w:szCs w:val="21"/>
         </w:rPr>
-        <w:t xml:space="preserve">Owners TBD (not Kelly):  competitive analysis and the product-performance narrative have no owner — assigning one is a Session 3 decision. Kelly tracks that it gets assigned; it does not default to her.</w:t>
+        <w:t xml:space="preserve">Owners TBD (not the facilitator):  competitive analysis and the product-performance narrative have no owner — assigning one is a Session 3 decision. The facilitator tracks that it gets assigned; it does not default to the facilitator.</w:t>
       </w:r>
     </w:p>
     <w:p>
@@ -1111,7 +1111,7 @@
           <w:sz w:val="21"/>
           <w:szCs w:val="21"/>
         </w:rPr>
-        <w:t xml:space="preserve">~1 week before:  Kelly asks Product for roadmap updates / demos, and Commercial for customer feedback &amp; requests.</w:t>
+        <w:t xml:space="preserve">~1 week before:  facilitator asks Product for roadmap updates / demos, and Commercial for customer feedback &amp; requests.</w:t>
       </w:r>
     </w:p>
     <w:p>
@@ -1129,7 +1129,7 @@
           <w:sz w:val="21"/>
           <w:szCs w:val="21"/>
         </w:rPr>
-        <w:t xml:space="preserve">~2 days before:  Kelly circulates the agenda and the outstanding-actions list.</w:t>
+        <w:t xml:space="preserve">~2 days before:  facilitator circulates the agenda and the outstanding-actions list.</w:t>
       </w:r>
     </w:p>
     <w:p>
@@ -1165,7 +1165,7 @@
           <w:sz w:val="21"/>
           <w:szCs w:val="21"/>
         </w:rPr>
-        <w:t xml:space="preserve">After the meeting:  Kelly sends a short summary — discussed / decided / actions + owners — and updates the tracker.</w:t>
+        <w:t xml:space="preserve">After the meeting:  facilitator sends a short summary — discussed / decided / actions + owners — and updates the tracker.</w:t>
       </w:r>
     </w:p>
     <w:p>
@@ -1217,7 +1217,7 @@
           <w:sz w:val="21"/>
           <w:szCs w:val="21"/>
         </w:rPr>
-        <w:t xml:space="preserve">Global Product SharePoint folder:  single home for the product roadmap with status and target dates. Kelly has access; Jason to commit Product team to keep it updated.</w:t>
+        <w:t xml:space="preserve">Global Product SharePoint folder:  single home for the product roadmap with status and target dates. Access is in place; Jason to commit Product team to keep it updated.</w:t>
       </w:r>
     </w:p>
     <w:p>

</xml_diff>